<commit_message>
deleted the secondary validation line
</commit_message>
<xml_diff>
--- a/Data Preparation/poc_train_test_strategy (1).docx
+++ b/Data Preparation/poc_train_test_strategy (1).docx
@@ -1,6 +1,6 @@
 
 <file path=word/document.xml><?xml version="1.0" encoding="utf-8"?>
-<w:document xmlns:wpc="http://schemas.microsoft.com/office/word/2010/wordprocessingCanvas" xmlns:cx="http://schemas.microsoft.com/office/drawing/2014/chartex" xmlns:cx1="http://schemas.microsoft.com/office/drawing/2015/9/8/chartex" xmlns:cx2="http://schemas.microsoft.com/office/drawing/2015/10/21/chartex" xmlns:cx3="http://schemas.microsoft.com/office/drawing/2016/5/9/chartex" xmlns:cx4="http://schemas.microsoft.com/office/drawing/2016/5/10/chartex" xmlns:cx5="http://schemas.microsoft.com/office/drawing/2016/5/11/chartex" xmlns:cx6="http://schemas.microsoft.com/office/drawing/2016/5/12/chartex" xmlns:cx7="http://schemas.microsoft.com/office/drawing/2016/5/13/chartex" xmlns:cx8="http://schemas.microsoft.com/office/drawing/2016/5/14/chartex" xmlns:mc="http://schemas.openxmlformats.org/markup-compatibility/2006" xmlns:aink="http://schemas.microsoft.com/office/drawing/2016/ink" xmlns:am3d="http://schemas.microsoft.com/office/drawing/2017/model3d" xmlns:o="urn:schemas-microsoft-com:office:office" xmlns:oel="http://schemas.microsoft.com/office/2019/extlst" xmlns:r="http://schemas.openxmlformats.org/officeDocument/2006/relationships" xmlns:m="http://schemas.openxmlformats.org/officeDocument/2006/math" xmlns:v="urn:schemas-microsoft-com:vml" xmlns:wp14="http://schemas.microsoft.com/office/word/2010/wordprocessingDrawing" xmlns:wp="http://schemas.openxmlformats.org/drawingml/2006/wordprocessingDrawing" xmlns:w10="urn:schemas-microsoft-com:office:word" xmlns:w="http://schemas.openxmlformats.org/wordprocessingml/2006/main" xmlns:w14="http://schemas.microsoft.com/office/word/2010/wordml" xmlns:w15="http://schemas.microsoft.com/office/word/2012/wordml" xmlns:w16cex="http://schemas.microsoft.com/office/word/2018/wordml/cex" xmlns:w16cid="http://schemas.microsoft.com/office/word/2016/wordml/cid" xmlns:w16="http://schemas.microsoft.com/office/word/2018/wordml" xmlns:w16du="http://schemas.microsoft.com/office/word/2023/wordml/word16du" xmlns:w16sdtdh="http://schemas.microsoft.com/office/word/2020/wordml/sdtdatahash" xmlns:w16sdtfl="http://schemas.microsoft.com/office/word/2024/wordml/sdtformatlock" xmlns:w16se="http://schemas.microsoft.com/office/word/2015/wordml/symex" xmlns:wpg="http://schemas.microsoft.com/office/word/2010/wordprocessingGroup" xmlns:wpi="http://schemas.microsoft.com/office/word/2010/wordprocessingInk" xmlns:wne="http://schemas.microsoft.com/office/word/2006/wordml" xmlns:wps="http://schemas.microsoft.com/office/word/2010/wordprocessingShape" mc:Ignorable="w14 w15 w16se w16cid w16 w16cex w16sdtdh w16sdtfl w16du wp14">
+<w:document xmlns:wpc="http://schemas.microsoft.com/office/word/2010/wordprocessingCanvas" xmlns:cx="http://schemas.microsoft.com/office/drawing/2014/chartex" xmlns:cx1="http://schemas.microsoft.com/office/drawing/2015/9/8/chartex" xmlns:mc="http://schemas.openxmlformats.org/markup-compatibility/2006" xmlns:o="urn:schemas-microsoft-com:office:office" xmlns:r="http://schemas.openxmlformats.org/officeDocument/2006/relationships" xmlns:m="http://schemas.openxmlformats.org/officeDocument/2006/math" xmlns:v="urn:schemas-microsoft-com:vml" xmlns:wp14="http://schemas.microsoft.com/office/word/2010/wordprocessingDrawing" xmlns:wp="http://schemas.openxmlformats.org/drawingml/2006/wordprocessingDrawing" xmlns:w10="urn:schemas-microsoft-com:office:word" xmlns:w="http://schemas.openxmlformats.org/wordprocessingml/2006/main" xmlns:w14="http://schemas.microsoft.com/office/word/2010/wordml" xmlns:w15="http://schemas.microsoft.com/office/word/2012/wordml" xmlns:w16se="http://schemas.microsoft.com/office/word/2015/wordml/symex" xmlns:wpg="http://schemas.microsoft.com/office/word/2010/wordprocessingGroup" xmlns:wpi="http://schemas.microsoft.com/office/word/2010/wordprocessingInk" xmlns:wne="http://schemas.microsoft.com/office/word/2006/wordml" xmlns:wps="http://schemas.microsoft.com/office/word/2010/wordprocessingShape" mc:Ignorable="w14 w15 w16se wp14">
   <w:body>
     <w:p>
       <w:pPr>
@@ -18,7 +18,13 @@
         <w:rPr>
           <w:color w:val="444444"/>
         </w:rPr>
-        <w:t>This document outlines the train-test strategy for evaluating Temporal Fusion Transformer (TFT) against the current production model (Snowflake ML Forecast / XGBoost) on the two-wheeler dealer-SKU forecasting problem.</w:t>
+        <w:t xml:space="preserve">This document outlines the train-test strategy for evaluating Temporal Fusion Transformer (TFT) against the current production model (Snowflake ML Forecast / XGBoost) on the two-wheeler dealer-SKU </w:t>
+      </w:r>
+      <w:r>
+        <w:rPr>
+          <w:color w:val="444444"/>
+        </w:rPr>
+        <w:t>forecasting problem.</w:t>
       </w:r>
     </w:p>
     <w:p>
@@ -42,7 +48,10 @@
         <w:pStyle w:val="Heading2"/>
       </w:pPr>
       <w:r>
-        <w:t>2. Data Filtering Criterion</w:t>
+        <w:t xml:space="preserve">2. Data Filtering </w:t>
+      </w:r>
+      <w:r>
+        <w:t>Criterion</w:t>
       </w:r>
     </w:p>
     <w:p>
@@ -50,7 +59,10 @@
         <w:spacing w:after="120"/>
       </w:pPr>
       <w:r>
-        <w:t>Only dealer-SKU combinations with at least 24 months of data will be included in training. This ensures every series used for training contains a minimum of two complete festive cycles, which is necessary for the model to distinguish genuine seasonal patterns from one-time spikes.</w:t>
+        <w:t>Only dealer-SKU combinations with at least 24 months of data will be included in training. This ensures every series used for training contains a minimum of two complete festive cycles, which is necessary for the model to distinguish genuine seas</w:t>
+      </w:r>
+      <w:r>
+        <w:t>onal patterns from one-time spikes.</w:t>
       </w:r>
     </w:p>
     <w:p>
@@ -79,7 +91,10 @@
         <w:spacing w:after="160"/>
       </w:pPr>
       <w:r>
-        <w:t>Both models are trained and evaluated on identical windows to ensure a fair, apples-to-apples comparison.</w:t>
+        <w:t>Both models are trained and evaluated on identica</w:t>
+      </w:r>
+      <w:r>
+        <w:t>l windows to ensure a fair, apples-to-apples comparison.</w:t>
       </w:r>
     </w:p>
     <w:tbl>
@@ -106,12 +121,6 @@
         <w:gridCol w:w="3480"/>
       </w:tblGrid>
       <w:tr>
-        <w:tblPrEx>
-          <w:tblCellMar>
-            <w:top w:w="0" w:type="dxa"/>
-            <w:bottom w:w="0" w:type="dxa"/>
-          </w:tblCellMar>
-        </w:tblPrEx>
         <w:trPr>
           <w:tblHeader/>
         </w:trPr>
@@ -253,12 +262,6 @@
         </w:tc>
       </w:tr>
       <w:tr>
-        <w:tblPrEx>
-          <w:tblCellMar>
-            <w:top w:w="0" w:type="dxa"/>
-            <w:bottom w:w="0" w:type="dxa"/>
-          </w:tblCellMar>
-        </w:tblPrEx>
         <w:tc>
           <w:tcPr>
             <w:tcW w:w="2200" w:type="dxa"/>
@@ -373,18 +376,20 @@
                 <w:sz w:val="20"/>
                 <w:szCs w:val="20"/>
               </w:rPr>
-              <w:t>Same window for both ensures fair comparison. No data beyond Sep 2025 is used in training.</w:t>
+              <w:t xml:space="preserve">Same window for both ensures fair comparison. No data beyond Sep 2025 is used in </w:t>
+            </w:r>
+            <w:r>
+              <w:rPr>
+                <w:color w:val="222222"/>
+                <w:sz w:val="20"/>
+                <w:szCs w:val="20"/>
+              </w:rPr>
+              <w:t>training.</w:t>
             </w:r>
           </w:p>
         </w:tc>
       </w:tr>
       <w:tr>
-        <w:tblPrEx>
-          <w:tblCellMar>
-            <w:top w:w="0" w:type="dxa"/>
-            <w:bottom w:w="0" w:type="dxa"/>
-          </w:tblCellMar>
-        </w:tblPrEx>
         <w:tc>
           <w:tcPr>
             <w:tcW w:w="2200" w:type="dxa"/>
@@ -505,12 +510,6 @@
         </w:tc>
       </w:tr>
       <w:tr>
-        <w:tblPrEx>
-          <w:tblCellMar>
-            <w:top w:w="0" w:type="dxa"/>
-            <w:bottom w:w="0" w:type="dxa"/>
-          </w:tblCellMar>
-        </w:tblPrEx>
         <w:tc>
           <w:tcPr>
             <w:tcW w:w="2200" w:type="dxa"/>
@@ -625,18 +624,20 @@
                 <w:sz w:val="20"/>
                 <w:szCs w:val="20"/>
               </w:rPr>
-              <w:t>Isolates festive period performance. TFT’s key advantage — covariate handling and attention — should be most visible here.</w:t>
+              <w:t xml:space="preserve">Isolates festive </w:t>
+            </w:r>
+            <w:r>
+              <w:rPr>
+                <w:color w:val="222222"/>
+                <w:sz w:val="20"/>
+                <w:szCs w:val="20"/>
+              </w:rPr>
+              <w:t>period performance. TFT’s key advantage — covariate handling and attention — should be most visible here.</w:t>
             </w:r>
           </w:p>
         </w:tc>
       </w:tr>
       <w:tr>
-        <w:tblPrEx>
-          <w:tblCellMar>
-            <w:top w:w="0" w:type="dxa"/>
-            <w:bottom w:w="0" w:type="dxa"/>
-          </w:tblCellMar>
-        </w:tblPrEx>
         <w:tc>
           <w:tcPr>
             <w:tcW w:w="2200" w:type="dxa"/>
@@ -757,12 +758,6 @@
         </w:tc>
       </w:tr>
       <w:tr>
-        <w:tblPrEx>
-          <w:tblCellMar>
-            <w:top w:w="0" w:type="dxa"/>
-            <w:bottom w:w="0" w:type="dxa"/>
-          </w:tblCellMar>
-        </w:tblPrEx>
         <w:tc>
           <w:tcPr>
             <w:tcW w:w="2200" w:type="dxa"/>
@@ -772,7 +767,7 @@
               <w:bottom w:val="single" w:sz="4" w:space="0" w:color="BBBBBB"/>
               <w:right w:val="single" w:sz="4" w:space="0" w:color="BBBBBB"/>
             </w:tcBorders>
-            <w:shd w:val="clear" w:color="auto" w:fill="EEF2F8"/>
+            <w:shd w:val="clear" w:color="auto" w:fill="FFFFFF"/>
             <w:tcMar>
               <w:top w:w="80" w:type="dxa"/>
               <w:left w:w="150" w:type="dxa"/>
@@ -790,7 +785,7 @@
                 <w:sz w:val="20"/>
                 <w:szCs w:val="20"/>
               </w:rPr>
-              <w:t>Secondary validation (recommended)</w:t>
+              <w:t>Forecast horizon</w:t>
             </w:r>
           </w:p>
         </w:tc>
@@ -803,23 +798,23 @@
               <w:bottom w:val="single" w:sz="4" w:space="0" w:color="BBBBBB"/>
               <w:right w:val="single" w:sz="4" w:space="0" w:color="BBBBBB"/>
             </w:tcBorders>
-            <w:shd w:val="clear" w:color="auto" w:fill="EEF2F8"/>
-            <w:tcMar>
-              <w:top w:w="80" w:type="dxa"/>
-              <w:left w:w="150" w:type="dxa"/>
-              <w:bottom w:w="80" w:type="dxa"/>
-              <w:right w:w="150" w:type="dxa"/>
-            </w:tcMar>
-            <w:vAlign w:val="center"/>
-          </w:tcPr>
-          <w:p>
-            <w:r>
-              <w:rPr>
-                <w:color w:val="222222"/>
-                <w:sz w:val="20"/>
-                <w:szCs w:val="20"/>
-              </w:rPr>
-              <w:t>Oct 2024 – Dec 2024</w:t>
+            <w:shd w:val="clear" w:color="auto" w:fill="FFFFFF"/>
+            <w:tcMar>
+              <w:top w:w="80" w:type="dxa"/>
+              <w:left w:w="150" w:type="dxa"/>
+              <w:bottom w:w="80" w:type="dxa"/>
+              <w:right w:w="150" w:type="dxa"/>
+            </w:tcMar>
+            <w:vAlign w:val="center"/>
+          </w:tcPr>
+          <w:p>
+            <w:r>
+              <w:rPr>
+                <w:color w:val="222222"/>
+                <w:sz w:val="20"/>
+                <w:szCs w:val="20"/>
+              </w:rPr>
+              <w:t>6 months</w:t>
             </w:r>
           </w:p>
         </w:tc>
@@ -832,23 +827,23 @@
               <w:bottom w:val="single" w:sz="4" w:space="0" w:color="BBBBBB"/>
               <w:right w:val="single" w:sz="4" w:space="0" w:color="BBBBBB"/>
             </w:tcBorders>
-            <w:shd w:val="clear" w:color="auto" w:fill="EEF2F8"/>
-            <w:tcMar>
-              <w:top w:w="80" w:type="dxa"/>
-              <w:left w:w="150" w:type="dxa"/>
-              <w:bottom w:w="80" w:type="dxa"/>
-              <w:right w:w="150" w:type="dxa"/>
-            </w:tcMar>
-            <w:vAlign w:val="center"/>
-          </w:tcPr>
-          <w:p>
-            <w:r>
-              <w:rPr>
-                <w:color w:val="222222"/>
-                <w:sz w:val="20"/>
-                <w:szCs w:val="20"/>
-              </w:rPr>
-              <w:t>Oct 2024 – Dec 2024</w:t>
+            <w:shd w:val="clear" w:color="auto" w:fill="FFFFFF"/>
+            <w:tcMar>
+              <w:top w:w="80" w:type="dxa"/>
+              <w:left w:w="150" w:type="dxa"/>
+              <w:bottom w:w="80" w:type="dxa"/>
+              <w:right w:w="150" w:type="dxa"/>
+            </w:tcMar>
+            <w:vAlign w:val="center"/>
+          </w:tcPr>
+          <w:p>
+            <w:r>
+              <w:rPr>
+                <w:color w:val="222222"/>
+                <w:sz w:val="20"/>
+                <w:szCs w:val="20"/>
+              </w:rPr>
+              <w:t>6 months</w:t>
             </w:r>
           </w:p>
         </w:tc>
@@ -861,44 +856,36 @@
               <w:bottom w:val="single" w:sz="4" w:space="0" w:color="BBBBBB"/>
               <w:right w:val="single" w:sz="4" w:space="0" w:color="BBBBBB"/>
             </w:tcBorders>
-            <w:shd w:val="clear" w:color="auto" w:fill="EEF2F8"/>
-            <w:tcMar>
-              <w:top w:w="80" w:type="dxa"/>
-              <w:left w:w="150" w:type="dxa"/>
-              <w:bottom w:w="80" w:type="dxa"/>
-              <w:right w:w="150" w:type="dxa"/>
-            </w:tcMar>
-            <w:vAlign w:val="center"/>
-          </w:tcPr>
-          <w:p>
-            <w:proofErr w:type="spellStart"/>
-            <w:r>
-              <w:rPr>
-                <w:color w:val="222222"/>
-                <w:sz w:val="20"/>
-                <w:szCs w:val="20"/>
-              </w:rPr>
-              <w:t>Backtested</w:t>
-            </w:r>
-            <w:proofErr w:type="spellEnd"/>
-            <w:r>
-              <w:rPr>
-                <w:color w:val="222222"/>
-                <w:sz w:val="20"/>
-                <w:szCs w:val="20"/>
-              </w:rPr>
-              <w:t xml:space="preserve"> evaluation on a second festive cycle to strengthen the festive performance story with more evidence.</w:t>
+            <w:shd w:val="clear" w:color="auto" w:fill="FFFFFF"/>
+            <w:tcMar>
+              <w:top w:w="80" w:type="dxa"/>
+              <w:left w:w="150" w:type="dxa"/>
+              <w:bottom w:w="80" w:type="dxa"/>
+              <w:right w:w="150" w:type="dxa"/>
+            </w:tcMar>
+            <w:vAlign w:val="center"/>
+          </w:tcPr>
+          <w:p>
+            <w:r>
+              <w:rPr>
+                <w:color w:val="222222"/>
+                <w:sz w:val="20"/>
+                <w:szCs w:val="20"/>
+              </w:rPr>
+              <w:t>Both models make a single 6-month</w:t>
+            </w:r>
+            <w:r>
+              <w:rPr>
+                <w:color w:val="222222"/>
+                <w:sz w:val="20"/>
+                <w:szCs w:val="20"/>
+              </w:rPr>
+              <w:t xml:space="preserve"> forecast call covering the full test window (Oct’ 25 to Mar’26) in one shot.</w:t>
             </w:r>
           </w:p>
         </w:tc>
       </w:tr>
       <w:tr>
-        <w:tblPrEx>
-          <w:tblCellMar>
-            <w:top w:w="0" w:type="dxa"/>
-            <w:bottom w:w="0" w:type="dxa"/>
-          </w:tblCellMar>
-        </w:tblPrEx>
         <w:tc>
           <w:tcPr>
             <w:tcW w:w="2200" w:type="dxa"/>
@@ -908,7 +895,7 @@
               <w:bottom w:val="single" w:sz="4" w:space="0" w:color="BBBBBB"/>
               <w:right w:val="single" w:sz="4" w:space="0" w:color="BBBBBB"/>
             </w:tcBorders>
-            <w:shd w:val="clear" w:color="auto" w:fill="FFFFFF"/>
+            <w:shd w:val="clear" w:color="auto" w:fill="EEF2F8"/>
             <w:tcMar>
               <w:top w:w="80" w:type="dxa"/>
               <w:left w:w="150" w:type="dxa"/>
@@ -926,132 +913,6 @@
                 <w:sz w:val="20"/>
                 <w:szCs w:val="20"/>
               </w:rPr>
-              <w:t>Forecast horizon</w:t>
-            </w:r>
-          </w:p>
-        </w:tc>
-        <w:tc>
-          <w:tcPr>
-            <w:tcW w:w="2200" w:type="dxa"/>
-            <w:tcBorders>
-              <w:top w:val="single" w:sz="4" w:space="0" w:color="BBBBBB"/>
-              <w:left w:val="single" w:sz="4" w:space="0" w:color="BBBBBB"/>
-              <w:bottom w:val="single" w:sz="4" w:space="0" w:color="BBBBBB"/>
-              <w:right w:val="single" w:sz="4" w:space="0" w:color="BBBBBB"/>
-            </w:tcBorders>
-            <w:shd w:val="clear" w:color="auto" w:fill="FFFFFF"/>
-            <w:tcMar>
-              <w:top w:w="80" w:type="dxa"/>
-              <w:left w:w="150" w:type="dxa"/>
-              <w:bottom w:w="80" w:type="dxa"/>
-              <w:right w:w="150" w:type="dxa"/>
-            </w:tcMar>
-            <w:vAlign w:val="center"/>
-          </w:tcPr>
-          <w:p>
-            <w:r>
-              <w:rPr>
-                <w:color w:val="222222"/>
-                <w:sz w:val="20"/>
-                <w:szCs w:val="20"/>
-              </w:rPr>
-              <w:t>6 months</w:t>
-            </w:r>
-          </w:p>
-        </w:tc>
-        <w:tc>
-          <w:tcPr>
-            <w:tcW w:w="2200" w:type="dxa"/>
-            <w:tcBorders>
-              <w:top w:val="single" w:sz="4" w:space="0" w:color="BBBBBB"/>
-              <w:left w:val="single" w:sz="4" w:space="0" w:color="BBBBBB"/>
-              <w:bottom w:val="single" w:sz="4" w:space="0" w:color="BBBBBB"/>
-              <w:right w:val="single" w:sz="4" w:space="0" w:color="BBBBBB"/>
-            </w:tcBorders>
-            <w:shd w:val="clear" w:color="auto" w:fill="FFFFFF"/>
-            <w:tcMar>
-              <w:top w:w="80" w:type="dxa"/>
-              <w:left w:w="150" w:type="dxa"/>
-              <w:bottom w:w="80" w:type="dxa"/>
-              <w:right w:w="150" w:type="dxa"/>
-            </w:tcMar>
-            <w:vAlign w:val="center"/>
-          </w:tcPr>
-          <w:p>
-            <w:r>
-              <w:rPr>
-                <w:color w:val="222222"/>
-                <w:sz w:val="20"/>
-                <w:szCs w:val="20"/>
-              </w:rPr>
-              <w:t>6 months</w:t>
-            </w:r>
-          </w:p>
-        </w:tc>
-        <w:tc>
-          <w:tcPr>
-            <w:tcW w:w="3480" w:type="dxa"/>
-            <w:tcBorders>
-              <w:top w:val="single" w:sz="4" w:space="0" w:color="BBBBBB"/>
-              <w:left w:val="single" w:sz="4" w:space="0" w:color="BBBBBB"/>
-              <w:bottom w:val="single" w:sz="4" w:space="0" w:color="BBBBBB"/>
-              <w:right w:val="single" w:sz="4" w:space="0" w:color="BBBBBB"/>
-            </w:tcBorders>
-            <w:shd w:val="clear" w:color="auto" w:fill="FFFFFF"/>
-            <w:tcMar>
-              <w:top w:w="80" w:type="dxa"/>
-              <w:left w:w="150" w:type="dxa"/>
-              <w:bottom w:w="80" w:type="dxa"/>
-              <w:right w:w="150" w:type="dxa"/>
-            </w:tcMar>
-            <w:vAlign w:val="center"/>
-          </w:tcPr>
-          <w:p>
-            <w:r>
-              <w:rPr>
-                <w:color w:val="222222"/>
-                <w:sz w:val="20"/>
-                <w:szCs w:val="20"/>
-              </w:rPr>
-              <w:t>Both models make a single 6-month forecast call covering the full test window (Oct’ 25 to Mar’26) in one shot.</w:t>
-            </w:r>
-          </w:p>
-        </w:tc>
-      </w:tr>
-      <w:tr>
-        <w:tblPrEx>
-          <w:tblCellMar>
-            <w:top w:w="0" w:type="dxa"/>
-            <w:bottom w:w="0" w:type="dxa"/>
-          </w:tblCellMar>
-        </w:tblPrEx>
-        <w:tc>
-          <w:tcPr>
-            <w:tcW w:w="2200" w:type="dxa"/>
-            <w:tcBorders>
-              <w:top w:val="single" w:sz="4" w:space="0" w:color="BBBBBB"/>
-              <w:left w:val="single" w:sz="4" w:space="0" w:color="BBBBBB"/>
-              <w:bottom w:val="single" w:sz="4" w:space="0" w:color="BBBBBB"/>
-              <w:right w:val="single" w:sz="4" w:space="0" w:color="BBBBBB"/>
-            </w:tcBorders>
-            <w:shd w:val="clear" w:color="auto" w:fill="EEF2F8"/>
-            <w:tcMar>
-              <w:top w:w="80" w:type="dxa"/>
-              <w:left w:w="150" w:type="dxa"/>
-              <w:bottom w:w="80" w:type="dxa"/>
-              <w:right w:w="150" w:type="dxa"/>
-            </w:tcMar>
-            <w:vAlign w:val="center"/>
-          </w:tcPr>
-          <w:p>
-            <w:r>
-              <w:rPr>
-                <w:b/>
-                <w:bCs/>
-                <w:color w:val="1F3864"/>
-                <w:sz w:val="20"/>
-                <w:szCs w:val="20"/>
-              </w:rPr>
               <w:t>Series included</w:t>
             </w:r>
           </w:p>
@@ -1151,11 +1012,26 @@
       </w:pPr>
     </w:p>
     <w:p>
+      <w:r>
+        <w:br w:type="page"/>
+      </w:r>
+    </w:p>
+    <w:p>
+      <w:pPr>
+        <w:spacing w:after="240"/>
+      </w:pPr>
+      <w:bookmarkStart w:id="0" w:name="_GoBack"/>
+      <w:bookmarkEnd w:id="0"/>
+    </w:p>
+    <w:p>
       <w:pPr>
         <w:pStyle w:val="Heading2"/>
       </w:pPr>
       <w:r>
-        <w:t>4. Evaluation Metrics</w:t>
+        <w:t xml:space="preserve">4. Evaluation </w:t>
+      </w:r>
+      <w:r>
+        <w:t>Metrics</w:t>
       </w:r>
     </w:p>
     <w:p>
@@ -1239,7 +1115,10 @@
         <w:spacing w:after="120"/>
       </w:pPr>
       <w:r>
-        <w:t>TFT will be considered a viable upgrade if it meets the following conditions:</w:t>
+        <w:t>TFT will be cons</w:t>
+      </w:r>
+      <w:r>
+        <w:t>idered a viable upgrade if it meets the following conditions:</w:t>
       </w:r>
     </w:p>
     <w:tbl>
@@ -1265,12 +1144,6 @@
         <w:gridCol w:w="3580"/>
       </w:tblGrid>
       <w:tr>
-        <w:tblPrEx>
-          <w:tblCellMar>
-            <w:top w:w="0" w:type="dxa"/>
-            <w:bottom w:w="0" w:type="dxa"/>
-          </w:tblCellMar>
-        </w:tblPrEx>
         <w:trPr>
           <w:tblHeader/>
         </w:trPr>
@@ -1378,12 +1251,6 @@
         </w:tc>
       </w:tr>
       <w:tr>
-        <w:tblPrEx>
-          <w:tblCellMar>
-            <w:top w:w="0" w:type="dxa"/>
-            <w:bottom w:w="0" w:type="dxa"/>
-          </w:tblCellMar>
-        </w:tblPrEx>
         <w:tc>
           <w:tcPr>
             <w:tcW w:w="3500" w:type="dxa"/>
@@ -1473,12 +1340,6 @@
         </w:tc>
       </w:tr>
       <w:tr>
-        <w:tblPrEx>
-          <w:tblCellMar>
-            <w:top w:w="0" w:type="dxa"/>
-            <w:bottom w:w="0" w:type="dxa"/>
-          </w:tblCellMar>
-        </w:tblPrEx>
         <w:tc>
           <w:tcPr>
             <w:tcW w:w="3500" w:type="dxa"/>
@@ -1504,7 +1365,15 @@
                 <w:sz w:val="20"/>
                 <w:szCs w:val="20"/>
               </w:rPr>
-              <w:t>MAPE parity — lean window (Jan–Mar)</w:t>
+              <w:t xml:space="preserve">MAPE parity — </w:t>
+            </w:r>
+            <w:r>
+              <w:rPr>
+                <w:color w:val="222222"/>
+                <w:sz w:val="20"/>
+                <w:szCs w:val="20"/>
+              </w:rPr>
+              <w:t>lean window (Jan–Mar)</w:t>
             </w:r>
           </w:p>
         </w:tc>
@@ -1568,12 +1437,6 @@
         </w:tc>
       </w:tr>
       <w:tr>
-        <w:tblPrEx>
-          <w:tblCellMar>
-            <w:top w:w="0" w:type="dxa"/>
-            <w:bottom w:w="0" w:type="dxa"/>
-          </w:tblCellMar>
-        </w:tblPrEx>
         <w:tc>
           <w:tcPr>
             <w:tcW w:w="3500" w:type="dxa"/>
@@ -1663,12 +1526,6 @@
         </w:tc>
       </w:tr>
       <w:tr>
-        <w:tblPrEx>
-          <w:tblCellMar>
-            <w:top w:w="0" w:type="dxa"/>
-            <w:bottom w:w="0" w:type="dxa"/>
-          </w:tblCellMar>
-        </w:tblPrEx>
         <w:tc>
           <w:tcPr>
             <w:tcW w:w="3500" w:type="dxa"/>
@@ -1694,7 +1551,15 @@
                 <w:sz w:val="20"/>
                 <w:szCs w:val="20"/>
               </w:rPr>
-              <w:t>Secondary festive validation (Oct–Dec 2024)</w:t>
+              <w:t>Secondary</w:t>
+            </w:r>
+            <w:r>
+              <w:rPr>
+                <w:color w:val="222222"/>
+                <w:sz w:val="20"/>
+                <w:szCs w:val="20"/>
+              </w:rPr>
+              <w:t xml:space="preserve"> festive validation (Oct–Dec 2024)</w:t>
             </w:r>
           </w:p>
         </w:tc>
@@ -1813,7 +1678,7 @@
 </file>
 
 <file path=word/numbering.xml><?xml version="1.0" encoding="utf-8"?>
-<w:numbering xmlns:wpc="http://schemas.microsoft.com/office/word/2010/wordprocessingCanvas" xmlns:cx="http://schemas.microsoft.com/office/drawing/2014/chartex" xmlns:cx1="http://schemas.microsoft.com/office/drawing/2015/9/8/chartex" xmlns:cx2="http://schemas.microsoft.com/office/drawing/2015/10/21/chartex" xmlns:cx3="http://schemas.microsoft.com/office/drawing/2016/5/9/chartex" xmlns:cx4="http://schemas.microsoft.com/office/drawing/2016/5/10/chartex" xmlns:cx5="http://schemas.microsoft.com/office/drawing/2016/5/11/chartex" xmlns:cx6="http://schemas.microsoft.com/office/drawing/2016/5/12/chartex" xmlns:cx7="http://schemas.microsoft.com/office/drawing/2016/5/13/chartex" xmlns:cx8="http://schemas.microsoft.com/office/drawing/2016/5/14/chartex" xmlns:mc="http://schemas.openxmlformats.org/markup-compatibility/2006" xmlns:aink="http://schemas.microsoft.com/office/drawing/2016/ink" xmlns:am3d="http://schemas.microsoft.com/office/drawing/2017/model3d" xmlns:o="urn:schemas-microsoft-com:office:office" xmlns:oel="http://schemas.microsoft.com/office/2019/extlst" xmlns:r="http://schemas.openxmlformats.org/officeDocument/2006/relationships" xmlns:m="http://schemas.openxmlformats.org/officeDocument/2006/math" xmlns:v="urn:schemas-microsoft-com:vml" xmlns:wp14="http://schemas.microsoft.com/office/word/2010/wordprocessingDrawing" xmlns:wp="http://schemas.openxmlformats.org/drawingml/2006/wordprocessingDrawing" xmlns:w10="urn:schemas-microsoft-com:office:word" xmlns:w="http://schemas.openxmlformats.org/wordprocessingml/2006/main" xmlns:w14="http://schemas.microsoft.com/office/word/2010/wordml" xmlns:w15="http://schemas.microsoft.com/office/word/2012/wordml" xmlns:w16cex="http://schemas.microsoft.com/office/word/2018/wordml/cex" xmlns:w16cid="http://schemas.microsoft.com/office/word/2016/wordml/cid" xmlns:w16="http://schemas.microsoft.com/office/word/2018/wordml" xmlns:w16du="http://schemas.microsoft.com/office/word/2023/wordml/word16du" xmlns:w16sdtdh="http://schemas.microsoft.com/office/word/2020/wordml/sdtdatahash" xmlns:w16sdtfl="http://schemas.microsoft.com/office/word/2024/wordml/sdtformatlock" xmlns:w16se="http://schemas.microsoft.com/office/word/2015/wordml/symex" xmlns:wpg="http://schemas.microsoft.com/office/word/2010/wordprocessingGroup" xmlns:wpi="http://schemas.microsoft.com/office/word/2010/wordprocessingInk" xmlns:wne="http://schemas.microsoft.com/office/word/2006/wordml" xmlns:wps="http://schemas.microsoft.com/office/word/2010/wordprocessingShape" mc:Ignorable="w14 w15 w16se w16cid w16 w16cex w16sdtdh w16sdtfl w16du wp14">
+<w:numbering xmlns:wpc="http://schemas.microsoft.com/office/word/2010/wordprocessingCanvas" xmlns:cx="http://schemas.microsoft.com/office/drawing/2014/chartex" xmlns:cx1="http://schemas.microsoft.com/office/drawing/2015/9/8/chartex" xmlns:mc="http://schemas.openxmlformats.org/markup-compatibility/2006" xmlns:o="urn:schemas-microsoft-com:office:office" xmlns:r="http://schemas.openxmlformats.org/officeDocument/2006/relationships" xmlns:m="http://schemas.openxmlformats.org/officeDocument/2006/math" xmlns:v="urn:schemas-microsoft-com:vml" xmlns:wp14="http://schemas.microsoft.com/office/word/2010/wordprocessingDrawing" xmlns:wp="http://schemas.openxmlformats.org/drawingml/2006/wordprocessingDrawing" xmlns:w10="urn:schemas-microsoft-com:office:word" xmlns:w="http://schemas.openxmlformats.org/wordprocessingml/2006/main" xmlns:w14="http://schemas.microsoft.com/office/word/2010/wordml" xmlns:w15="http://schemas.microsoft.com/office/word/2012/wordml" xmlns:w16se="http://schemas.microsoft.com/office/word/2015/wordml/symex" xmlns:wpg="http://schemas.microsoft.com/office/word/2010/wordprocessingGroup" xmlns:wpi="http://schemas.microsoft.com/office/word/2010/wordprocessingInk" xmlns:wne="http://schemas.microsoft.com/office/word/2006/wordml" xmlns:wps="http://schemas.microsoft.com/office/word/2010/wordprocessingShape" mc:Ignorable="w14 w15 w16se wp14">
   <w:abstractNum w:abstractNumId="0" w15:restartNumberingAfterBreak="0">
     <w:nsid w:val="646002EE"/>
     <w:multiLevelType w:val="hybridMultilevel"/>
@@ -1954,13 +1819,13 @@
       <w:lvlJc w:val="left"/>
     </w:lvl>
   </w:abstractNum>
-  <w:num w:numId="1" w16cid:durableId="708723789">
+  <w:num w:numId="1">
     <w:abstractNumId w:val="0"/>
     <w:lvlOverride w:ilvl="0">
       <w:startOverride w:val="1"/>
     </w:lvlOverride>
   </w:num>
-  <w:num w:numId="2" w16cid:durableId="824585102">
+  <w:num w:numId="2">
     <w:abstractNumId w:val="1"/>
     <w:lvlOverride w:ilvl="0">
       <w:startOverride w:val="1"/>
@@ -1970,7 +1835,7 @@
 </file>
 
 <file path=word/styles.xml><?xml version="1.0" encoding="utf-8"?>
-<w:styles xmlns:mc="http://schemas.openxmlformats.org/markup-compatibility/2006" xmlns:r="http://schemas.openxmlformats.org/officeDocument/2006/relationships" xmlns:w="http://schemas.openxmlformats.org/wordprocessingml/2006/main" xmlns:w14="http://schemas.microsoft.com/office/word/2010/wordml" xmlns:w15="http://schemas.microsoft.com/office/word/2012/wordml" xmlns:w16cex="http://schemas.microsoft.com/office/word/2018/wordml/cex" xmlns:w16cid="http://schemas.microsoft.com/office/word/2016/wordml/cid" xmlns:w16="http://schemas.microsoft.com/office/word/2018/wordml" xmlns:w16du="http://schemas.microsoft.com/office/word/2023/wordml/word16du" xmlns:w16sdtdh="http://schemas.microsoft.com/office/word/2020/wordml/sdtdatahash" xmlns:w16sdtfl="http://schemas.microsoft.com/office/word/2024/wordml/sdtformatlock" xmlns:w16se="http://schemas.microsoft.com/office/word/2015/wordml/symex" mc:Ignorable="w14 w15 w16se w16cid w16 w16cex w16sdtdh w16sdtfl w16du">
+<w:styles xmlns:mc="http://schemas.openxmlformats.org/markup-compatibility/2006" xmlns:r="http://schemas.openxmlformats.org/officeDocument/2006/relationships" xmlns:w="http://schemas.openxmlformats.org/wordprocessingml/2006/main" xmlns:w14="http://schemas.microsoft.com/office/word/2010/wordml" xmlns:w15="http://schemas.microsoft.com/office/word/2012/wordml" xmlns:w16se="http://schemas.microsoft.com/office/word/2015/wordml/symex" mc:Ignorable="w14 w15 w16se">
   <w:docDefaults>
     <w:rPrDefault>
       <w:rPr>
@@ -1982,7 +1847,7 @@
     </w:rPrDefault>
     <w:pPrDefault/>
   </w:docDefaults>
-  <w:latentStyles w:defLockedState="0" w:defUIPriority="99" w:defSemiHidden="0" w:defUnhideWhenUsed="0" w:defQFormat="0" w:count="376">
+  <w:latentStyles w:defLockedState="0" w:defUIPriority="99" w:defSemiHidden="0" w:defUnhideWhenUsed="0" w:defQFormat="0" w:count="371">
     <w:lsdException w:name="Normal" w:uiPriority="0" w:qFormat="1"/>
     <w:lsdException w:name="heading 1" w:uiPriority="9" w:qFormat="1"/>
     <w:lsdException w:name="heading 2" w:semiHidden="1" w:uiPriority="9" w:unhideWhenUsed="1" w:qFormat="1"/>
@@ -2354,11 +2219,6 @@
     <w:lsdException w:name="List Table 5 Dark Accent 6" w:uiPriority="50"/>
     <w:lsdException w:name="List Table 6 Colorful Accent 6" w:uiPriority="51"/>
     <w:lsdException w:name="List Table 7 Colorful Accent 6" w:uiPriority="52"/>
-    <w:lsdException w:name="Mention" w:semiHidden="1" w:unhideWhenUsed="1"/>
-    <w:lsdException w:name="Smart Hyperlink" w:semiHidden="1" w:unhideWhenUsed="1"/>
-    <w:lsdException w:name="Hashtag" w:semiHidden="1" w:unhideWhenUsed="1"/>
-    <w:lsdException w:name="Unresolved Mention" w:semiHidden="1" w:unhideWhenUsed="1"/>
-    <w:lsdException w:name="Smart Link" w:semiHidden="1" w:unhideWhenUsed="1"/>
   </w:latentStyles>
   <w:style w:type="paragraph" w:default="1" w:styleId="Normal">
     <w:name w:val="Normal"/>
@@ -2456,6 +2316,7 @@
   <w:style w:type="character" w:default="1" w:styleId="DefaultParagraphFont">
     <w:name w:val="Default Paragraph Font"/>
     <w:uiPriority w:val="1"/>
+    <w:semiHidden/>
     <w:unhideWhenUsed/>
   </w:style>
   <w:style w:type="table" w:default="1" w:styleId="TableNormal">

</xml_diff>

<commit_message>
added groups of months analysis
</commit_message>
<xml_diff>
--- a/Data Preparation/poc_train_test_strategy (1).docx
+++ b/Data Preparation/poc_train_test_strategy (1).docx
@@ -18,13 +18,7 @@
         <w:rPr>
           <w:color w:val="444444"/>
         </w:rPr>
-        <w:t xml:space="preserve">This document outlines the train-test strategy for evaluating Temporal Fusion Transformer (TFT) against the current production model (Snowflake ML Forecast / XGBoost) on the two-wheeler dealer-SKU </w:t>
-      </w:r>
-      <w:r>
-        <w:rPr>
-          <w:color w:val="444444"/>
-        </w:rPr>
-        <w:t>forecasting problem.</w:t>
+        <w:t>This document outlines the train-test strategy for evaluating Temporal Fusion Transformer (TFT) against the current production model (Snowflake ML Forecast / XGBoost) on the two-wheeler dealer-SKU forecasting problem.</w:t>
       </w:r>
     </w:p>
     <w:p>
@@ -48,10 +42,7 @@
         <w:pStyle w:val="Heading2"/>
       </w:pPr>
       <w:r>
-        <w:t xml:space="preserve">2. Data Filtering </w:t>
-      </w:r>
-      <w:r>
-        <w:t>Criterion</w:t>
+        <w:t>2. Data Filtering Criterion</w:t>
       </w:r>
     </w:p>
     <w:p>
@@ -59,10 +50,7 @@
         <w:spacing w:after="120"/>
       </w:pPr>
       <w:r>
-        <w:t>Only dealer-SKU combinations with at least 24 months of data will be included in training. This ensures every series used for training contains a minimum of two complete festive cycles, which is necessary for the model to distinguish genuine seas</w:t>
-      </w:r>
-      <w:r>
-        <w:t>onal patterns from one-time spikes.</w:t>
+        <w:t>Only dealer-SKU combinations with at least 24 months of data will be included in training. This ensures every series used for training contains a minimum of two complete festive cycles, which is necessary for the model to distinguish genuine seasonal patterns from one-time spikes.</w:t>
       </w:r>
     </w:p>
     <w:p>
@@ -91,10 +79,7 @@
         <w:spacing w:after="160"/>
       </w:pPr>
       <w:r>
-        <w:t>Both models are trained and evaluated on identica</w:t>
-      </w:r>
-      <w:r>
-        <w:t>l windows to ensure a fair, apples-to-apples comparison.</w:t>
+        <w:t>Both models are trained and evaluated on identical windows to ensure a fair, apples-to-apples comparison.</w:t>
       </w:r>
     </w:p>
     <w:tbl>
@@ -376,15 +361,7 @@
                 <w:sz w:val="20"/>
                 <w:szCs w:val="20"/>
               </w:rPr>
-              <w:t xml:space="preserve">Same window for both ensures fair comparison. No data beyond Sep 2025 is used in </w:t>
-            </w:r>
-            <w:r>
-              <w:rPr>
-                <w:color w:val="222222"/>
-                <w:sz w:val="20"/>
-                <w:szCs w:val="20"/>
-              </w:rPr>
-              <w:t>training.</w:t>
+              <w:t>Same window for both ensures fair comparison. No data beyond Sep 2025 is used in training.</w:t>
             </w:r>
           </w:p>
         </w:tc>
@@ -624,15 +601,7 @@
                 <w:sz w:val="20"/>
                 <w:szCs w:val="20"/>
               </w:rPr>
-              <w:t xml:space="preserve">Isolates festive </w:t>
-            </w:r>
-            <w:r>
-              <w:rPr>
-                <w:color w:val="222222"/>
-                <w:sz w:val="20"/>
-                <w:szCs w:val="20"/>
-              </w:rPr>
-              <w:t>period performance. TFT’s key advantage — covariate handling and attention — should be most visible here.</w:t>
+              <w:t>Isolates festive period performance. TFT’s key advantage — covariate handling and attention — should be most visible here.</w:t>
             </w:r>
           </w:p>
         </w:tc>
@@ -872,15 +841,7 @@
                 <w:sz w:val="20"/>
                 <w:szCs w:val="20"/>
               </w:rPr>
-              <w:t>Both models make a single 6-month</w:t>
-            </w:r>
-            <w:r>
-              <w:rPr>
-                <w:color w:val="222222"/>
-                <w:sz w:val="20"/>
-                <w:szCs w:val="20"/>
-              </w:rPr>
-              <w:t xml:space="preserve"> forecast call covering the full test window (Oct’ 25 to Mar’26) in one shot.</w:t>
+              <w:t>Both models make a single 6-month forecast call covering the full test window (Oct’ 25 to Mar’26) in one shot.</w:t>
             </w:r>
           </w:p>
         </w:tc>
@@ -1020,18 +981,13 @@
       <w:pPr>
         <w:spacing w:after="240"/>
       </w:pPr>
-      <w:bookmarkStart w:id="0" w:name="_GoBack"/>
-      <w:bookmarkEnd w:id="0"/>
     </w:p>
     <w:p>
       <w:pPr>
         <w:pStyle w:val="Heading2"/>
       </w:pPr>
       <w:r>
-        <w:t xml:space="preserve">4. Evaluation </w:t>
-      </w:r>
-      <w:r>
-        <w:t>Metrics</w:t>
+        <w:t>4. Evaluation Metrics</w:t>
       </w:r>
     </w:p>
     <w:p>
@@ -1115,10 +1071,7 @@
         <w:spacing w:after="120"/>
       </w:pPr>
       <w:r>
-        <w:t>TFT will be cons</w:t>
-      </w:r>
-      <w:r>
-        <w:t>idered a viable upgrade if it meets the following conditions:</w:t>
+        <w:t>TFT will be considered a viable upgrade if it meets the following conditions:</w:t>
       </w:r>
     </w:p>
     <w:tbl>
@@ -1365,15 +1318,7 @@
                 <w:sz w:val="20"/>
                 <w:szCs w:val="20"/>
               </w:rPr>
-              <w:t xml:space="preserve">MAPE parity — </w:t>
-            </w:r>
-            <w:r>
-              <w:rPr>
-                <w:color w:val="222222"/>
-                <w:sz w:val="20"/>
-                <w:szCs w:val="20"/>
-              </w:rPr>
-              <w:t>lean window (Jan–Mar)</w:t>
+              <w:t>MAPE parity — lean window (Jan–Mar)</w:t>
             </w:r>
           </w:p>
         </w:tc>
@@ -1551,15 +1496,7 @@
                 <w:sz w:val="20"/>
                 <w:szCs w:val="20"/>
               </w:rPr>
-              <w:t>Secondary</w:t>
-            </w:r>
-            <w:r>
-              <w:rPr>
-                <w:color w:val="222222"/>
-                <w:sz w:val="20"/>
-                <w:szCs w:val="20"/>
-              </w:rPr>
-              <w:t xml:space="preserve"> festive validation (Oct–Dec 2024)</w:t>
+              <w:t>Secondary festive validation (Oct–Dec 2024)</w:t>
             </w:r>
           </w:p>
         </w:tc>
@@ -1623,6 +1560,410 @@
         </w:tc>
       </w:tr>
     </w:tbl>
+    <w:p>
+      <w:pPr>
+        <w:spacing w:after="240"/>
+      </w:pPr>
+      <w:r>
+        <w:tab/>
+      </w:r>
+      <w:r>
+        <w:tab/>
+      </w:r>
+      <w:r>
+        <w:tab/>
+      </w:r>
+      <w:r>
+        <w:tab/>
+      </w:r>
+      <w:r>
+        <w:tab/>
+      </w:r>
+      <w:r>
+        <w:tab/>
+      </w:r>
+      <w:r>
+        <w:tab/>
+      </w:r>
+      <w:r>
+        <w:tab/>
+      </w:r>
+      <w:r>
+        <w:tab/>
+      </w:r>
+      <w:r>
+        <w:tab/>
+      </w:r>
+      <w:r>
+        <w:tab/>
+      </w:r>
+      <w:r>
+        <w:tab/>
+      </w:r>
+      <w:r>
+        <w:tab/>
+      </w:r>
+      <w:r>
+        <w:tab/>
+      </w:r>
+    </w:p>
+    <w:tbl>
+      <w:tblPr>
+        <w:tblW w:w="8180" w:type="dxa"/>
+        <w:tblLook w:val="04A0" w:firstRow="1" w:lastRow="0" w:firstColumn="1" w:lastColumn="0" w:noHBand="0" w:noVBand="1"/>
+      </w:tblPr>
+      <w:tblGrid>
+        <w:gridCol w:w="2540"/>
+        <w:gridCol w:w="5779"/>
+      </w:tblGrid>
+      <w:tr>
+        <w:trPr>
+          <w:trHeight w:val="300"/>
+        </w:trPr>
+        <w:tc>
+          <w:tcPr>
+            <w:tcW w:w="2440" w:type="dxa"/>
+            <w:tcBorders>
+              <w:top w:val="single" w:sz="8" w:space="0" w:color="auto"/>
+              <w:left w:val="single" w:sz="8" w:space="0" w:color="auto"/>
+              <w:bottom w:val="single" w:sz="8" w:space="0" w:color="auto"/>
+              <w:right w:val="single" w:sz="8" w:space="0" w:color="auto"/>
+            </w:tcBorders>
+            <w:shd w:val="clear" w:color="000000" w:fill="5B9BD5"/>
+            <w:noWrap/>
+            <w:vAlign w:val="center"/>
+            <w:hideMark/>
+          </w:tcPr>
+          <w:p>
+            <w:pPr>
+              <w:rPr>
+                <w:rFonts w:ascii="Calibri" w:eastAsia="Times New Roman" w:hAnsi="Calibri" w:cs="Times New Roman"/>
+                <w:b/>
+                <w:bCs/>
+                <w:color w:val="FFFFFF"/>
+              </w:rPr>
+            </w:pPr>
+            <w:r>
+              <w:rPr>
+                <w:rFonts w:ascii="Calibri" w:eastAsia="Times New Roman" w:hAnsi="Calibri" w:cs="Times New Roman"/>
+                <w:b/>
+                <w:bCs/>
+                <w:color w:val="FFFFFF"/>
+              </w:rPr>
+              <w:t>GROUPING_OF_MONTHS</w:t>
+            </w:r>
+          </w:p>
+        </w:tc>
+        <w:tc>
+          <w:tcPr>
+            <w:tcW w:w="5740" w:type="dxa"/>
+            <w:tcBorders>
+              <w:top w:val="single" w:sz="8" w:space="0" w:color="auto"/>
+              <w:left w:val="nil"/>
+              <w:bottom w:val="single" w:sz="8" w:space="0" w:color="auto"/>
+              <w:right w:val="single" w:sz="8" w:space="0" w:color="auto"/>
+            </w:tcBorders>
+            <w:shd w:val="clear" w:color="000000" w:fill="5B9BD5"/>
+            <w:noWrap/>
+            <w:vAlign w:val="center"/>
+            <w:hideMark/>
+          </w:tcPr>
+          <w:p>
+            <w:pPr>
+              <w:rPr>
+                <w:rFonts w:ascii="Calibri" w:eastAsia="Times New Roman" w:hAnsi="Calibri" w:cs="Times New Roman"/>
+                <w:b/>
+                <w:bCs/>
+                <w:color w:val="FFFFFF"/>
+              </w:rPr>
+            </w:pPr>
+            <w:r>
+              <w:rPr>
+                <w:rFonts w:ascii="Calibri" w:eastAsia="Times New Roman" w:hAnsi="Calibri" w:cs="Times New Roman"/>
+                <w:b/>
+                <w:bCs/>
+                <w:color w:val="FFFFFF"/>
+              </w:rPr>
+              <w:t>UNIQUE_PARENT_DEALER_CODE_MODEL_FAMILY_COMBOS</w:t>
+            </w:r>
+          </w:p>
+        </w:tc>
+      </w:tr>
+      <w:tr>
+        <w:trPr>
+          <w:trHeight w:val="300"/>
+        </w:trPr>
+        <w:tc>
+          <w:tcPr>
+            <w:tcW w:w="2440" w:type="dxa"/>
+            <w:tcBorders>
+              <w:top w:val="nil"/>
+              <w:left w:val="single" w:sz="8" w:space="0" w:color="auto"/>
+              <w:bottom w:val="single" w:sz="8" w:space="0" w:color="auto"/>
+              <w:right w:val="single" w:sz="8" w:space="0" w:color="auto"/>
+            </w:tcBorders>
+            <w:shd w:val="clear" w:color="auto" w:fill="auto"/>
+            <w:vAlign w:val="center"/>
+            <w:hideMark/>
+          </w:tcPr>
+          <w:p>
+            <w:pPr>
+              <w:rPr>
+                <w:rFonts w:ascii="Calibri" w:eastAsia="Times New Roman" w:hAnsi="Calibri" w:cs="Times New Roman"/>
+                <w:color w:val="000000"/>
+              </w:rPr>
+            </w:pPr>
+            <w:r>
+              <w:rPr>
+                <w:rFonts w:ascii="Calibri" w:eastAsia="Times New Roman" w:hAnsi="Calibri" w:cs="Times New Roman"/>
+                <w:color w:val="000000"/>
+              </w:rPr>
+              <w:t>&lt;12</w:t>
+            </w:r>
+          </w:p>
+        </w:tc>
+        <w:tc>
+          <w:tcPr>
+            <w:tcW w:w="5740" w:type="dxa"/>
+            <w:tcBorders>
+              <w:top w:val="nil"/>
+              <w:left w:val="nil"/>
+              <w:bottom w:val="single" w:sz="8" w:space="0" w:color="auto"/>
+              <w:right w:val="single" w:sz="8" w:space="0" w:color="auto"/>
+            </w:tcBorders>
+            <w:shd w:val="clear" w:color="auto" w:fill="auto"/>
+            <w:vAlign w:val="center"/>
+            <w:hideMark/>
+          </w:tcPr>
+          <w:p>
+            <w:pPr>
+              <w:jc w:val="right"/>
+              <w:rPr>
+                <w:rFonts w:ascii="Calibri" w:eastAsia="Times New Roman" w:hAnsi="Calibri" w:cs="Times New Roman"/>
+                <w:color w:val="000000"/>
+              </w:rPr>
+            </w:pPr>
+            <w:r>
+              <w:rPr>
+                <w:rFonts w:ascii="Calibri" w:eastAsia="Times New Roman" w:hAnsi="Calibri" w:cs="Times New Roman"/>
+                <w:color w:val="000000"/>
+              </w:rPr>
+              <w:t>15699</w:t>
+            </w:r>
+          </w:p>
+        </w:tc>
+      </w:tr>
+      <w:tr>
+        <w:trPr>
+          <w:trHeight w:val="300"/>
+        </w:trPr>
+        <w:tc>
+          <w:tcPr>
+            <w:tcW w:w="2440" w:type="dxa"/>
+            <w:tcBorders>
+              <w:top w:val="nil"/>
+              <w:left w:val="single" w:sz="8" w:space="0" w:color="auto"/>
+              <w:bottom w:val="single" w:sz="8" w:space="0" w:color="auto"/>
+              <w:right w:val="single" w:sz="8" w:space="0" w:color="auto"/>
+            </w:tcBorders>
+            <w:shd w:val="clear" w:color="auto" w:fill="auto"/>
+            <w:vAlign w:val="center"/>
+            <w:hideMark/>
+          </w:tcPr>
+          <w:p>
+            <w:pPr>
+              <w:rPr>
+                <w:rFonts w:ascii="Calibri" w:eastAsia="Times New Roman" w:hAnsi="Calibri" w:cs="Times New Roman"/>
+                <w:color w:val="000000"/>
+              </w:rPr>
+            </w:pPr>
+            <w:r>
+              <w:rPr>
+                <w:rFonts w:ascii="Calibri" w:eastAsia="Times New Roman" w:hAnsi="Calibri" w:cs="Times New Roman"/>
+                <w:color w:val="000000"/>
+              </w:rPr>
+              <w:t>&gt;=24</w:t>
+            </w:r>
+          </w:p>
+        </w:tc>
+        <w:tc>
+          <w:tcPr>
+            <w:tcW w:w="5740" w:type="dxa"/>
+            <w:tcBorders>
+              <w:top w:val="nil"/>
+              <w:left w:val="nil"/>
+              <w:bottom w:val="single" w:sz="8" w:space="0" w:color="auto"/>
+              <w:right w:val="single" w:sz="8" w:space="0" w:color="auto"/>
+            </w:tcBorders>
+            <w:shd w:val="clear" w:color="auto" w:fill="auto"/>
+            <w:vAlign w:val="center"/>
+            <w:hideMark/>
+          </w:tcPr>
+          <w:p>
+            <w:pPr>
+              <w:jc w:val="right"/>
+              <w:rPr>
+                <w:rFonts w:ascii="Calibri" w:eastAsia="Times New Roman" w:hAnsi="Calibri" w:cs="Times New Roman"/>
+                <w:color w:val="000000"/>
+              </w:rPr>
+            </w:pPr>
+            <w:r>
+              <w:rPr>
+                <w:rFonts w:ascii="Calibri" w:eastAsia="Times New Roman" w:hAnsi="Calibri" w:cs="Times New Roman"/>
+                <w:color w:val="000000"/>
+              </w:rPr>
+              <w:t>74383</w:t>
+            </w:r>
+          </w:p>
+        </w:tc>
+      </w:tr>
+      <w:tr>
+        <w:trPr>
+          <w:trHeight w:val="300"/>
+        </w:trPr>
+        <w:tc>
+          <w:tcPr>
+            <w:tcW w:w="2440" w:type="dxa"/>
+            <w:tcBorders>
+              <w:top w:val="nil"/>
+              <w:left w:val="single" w:sz="8" w:space="0" w:color="auto"/>
+              <w:bottom w:val="single" w:sz="8" w:space="0" w:color="auto"/>
+              <w:right w:val="single" w:sz="8" w:space="0" w:color="auto"/>
+            </w:tcBorders>
+            <w:shd w:val="clear" w:color="auto" w:fill="auto"/>
+            <w:vAlign w:val="center"/>
+            <w:hideMark/>
+          </w:tcPr>
+          <w:p>
+            <w:pPr>
+              <w:rPr>
+                <w:rFonts w:ascii="Calibri" w:eastAsia="Times New Roman" w:hAnsi="Calibri" w:cs="Times New Roman"/>
+                <w:color w:val="000000"/>
+              </w:rPr>
+            </w:pPr>
+            <w:r>
+              <w:rPr>
+                <w:rFonts w:ascii="Calibri" w:eastAsia="Times New Roman" w:hAnsi="Calibri" w:cs="Times New Roman"/>
+                <w:color w:val="000000"/>
+              </w:rPr>
+              <w:t>18 to 23</w:t>
+            </w:r>
+          </w:p>
+        </w:tc>
+        <w:tc>
+          <w:tcPr>
+            <w:tcW w:w="5740" w:type="dxa"/>
+            <w:tcBorders>
+              <w:top w:val="nil"/>
+              <w:left w:val="nil"/>
+              <w:bottom w:val="single" w:sz="8" w:space="0" w:color="auto"/>
+              <w:right w:val="single" w:sz="8" w:space="0" w:color="auto"/>
+            </w:tcBorders>
+            <w:shd w:val="clear" w:color="auto" w:fill="auto"/>
+            <w:vAlign w:val="center"/>
+            <w:hideMark/>
+          </w:tcPr>
+          <w:p>
+            <w:pPr>
+              <w:jc w:val="right"/>
+              <w:rPr>
+                <w:rFonts w:ascii="Calibri" w:eastAsia="Times New Roman" w:hAnsi="Calibri" w:cs="Times New Roman"/>
+                <w:color w:val="000000"/>
+              </w:rPr>
+            </w:pPr>
+            <w:r>
+              <w:rPr>
+                <w:rFonts w:ascii="Calibri" w:eastAsia="Times New Roman" w:hAnsi="Calibri" w:cs="Times New Roman"/>
+                <w:color w:val="000000"/>
+              </w:rPr>
+              <w:t>9505</w:t>
+            </w:r>
+          </w:p>
+        </w:tc>
+      </w:tr>
+      <w:tr>
+        <w:trPr>
+          <w:trHeight w:val="300"/>
+        </w:trPr>
+        <w:tc>
+          <w:tcPr>
+            <w:tcW w:w="2440" w:type="dxa"/>
+            <w:tcBorders>
+              <w:top w:val="nil"/>
+              <w:left w:val="single" w:sz="8" w:space="0" w:color="auto"/>
+              <w:bottom w:val="single" w:sz="8" w:space="0" w:color="auto"/>
+              <w:right w:val="single" w:sz="8" w:space="0" w:color="auto"/>
+            </w:tcBorders>
+            <w:shd w:val="clear" w:color="auto" w:fill="auto"/>
+            <w:vAlign w:val="center"/>
+            <w:hideMark/>
+          </w:tcPr>
+          <w:p>
+            <w:pPr>
+              <w:rPr>
+                <w:rFonts w:ascii="Calibri" w:eastAsia="Times New Roman" w:hAnsi="Calibri" w:cs="Times New Roman"/>
+                <w:color w:val="000000"/>
+              </w:rPr>
+            </w:pPr>
+            <w:r>
+              <w:rPr>
+                <w:rFonts w:ascii="Calibri" w:eastAsia="Times New Roman" w:hAnsi="Calibri" w:cs="Times New Roman"/>
+                <w:color w:val="000000"/>
+              </w:rPr>
+              <w:t>12 to 17</w:t>
+            </w:r>
+          </w:p>
+        </w:tc>
+        <w:tc>
+          <w:tcPr>
+            <w:tcW w:w="5740" w:type="dxa"/>
+            <w:tcBorders>
+              <w:top w:val="nil"/>
+              <w:left w:val="nil"/>
+              <w:bottom w:val="single" w:sz="8" w:space="0" w:color="auto"/>
+              <w:right w:val="single" w:sz="8" w:space="0" w:color="auto"/>
+            </w:tcBorders>
+            <w:shd w:val="clear" w:color="auto" w:fill="auto"/>
+            <w:vAlign w:val="center"/>
+            <w:hideMark/>
+          </w:tcPr>
+          <w:p>
+            <w:pPr>
+              <w:jc w:val="right"/>
+              <w:rPr>
+                <w:rFonts w:ascii="Calibri" w:eastAsia="Times New Roman" w:hAnsi="Calibri" w:cs="Times New Roman"/>
+                <w:color w:val="000000"/>
+              </w:rPr>
+            </w:pPr>
+            <w:r>
+              <w:rPr>
+                <w:rFonts w:ascii="Calibri" w:eastAsia="Times New Roman" w:hAnsi="Calibri" w:cs="Times New Roman"/>
+                <w:color w:val="000000"/>
+              </w:rPr>
+              <w:t>9261</w:t>
+            </w:r>
+          </w:p>
+        </w:tc>
+      </w:tr>
+    </w:tbl>
+    <w:p>
+      <w:pPr>
+        <w:spacing w:after="240"/>
+      </w:pPr>
+      <w:r>
+        <w:tab/>
+      </w:r>
+      <w:r>
+        <w:tab/>
+      </w:r>
+      <w:bookmarkStart w:id="0" w:name="_GoBack"/>
+      <w:bookmarkEnd w:id="0"/>
+    </w:p>
+    <w:p>
+      <w:pPr>
+        <w:spacing w:after="240"/>
+      </w:pPr>
+    </w:p>
     <w:p>
       <w:pPr>
         <w:spacing w:after="240"/>
@@ -1635,6 +1976,12 @@
         </w:pBdr>
         <w:spacing w:after="80"/>
         <w:ind w:left="360"/>
+        <w:rPr>
+          <w:iCs/>
+          <w:color w:val="555555"/>
+          <w:sz w:val="20"/>
+          <w:szCs w:val="20"/>
+        </w:rPr>
       </w:pPr>
       <w:r>
         <w:rPr>
@@ -1665,6 +2012,56 @@
           <w:szCs w:val="20"/>
         </w:rPr>
         <w:t>.</w:t>
+      </w:r>
+      <w:r>
+        <w:rPr>
+          <w:i/>
+          <w:iCs/>
+          <w:color w:val="555555"/>
+          <w:sz w:val="20"/>
+          <w:szCs w:val="20"/>
+        </w:rPr>
+        <w:tab/>
+      </w:r>
+      <w:r>
+        <w:rPr>
+          <w:i/>
+          <w:iCs/>
+          <w:color w:val="555555"/>
+          <w:sz w:val="20"/>
+          <w:szCs w:val="20"/>
+        </w:rPr>
+        <w:tab/>
+      </w:r>
+      <w:r>
+        <w:rPr>
+          <w:i/>
+          <w:iCs/>
+          <w:color w:val="555555"/>
+          <w:sz w:val="20"/>
+          <w:szCs w:val="20"/>
+        </w:rPr>
+        <w:tab/>
+      </w:r>
+      <w:r>
+        <w:rPr>
+          <w:i/>
+          <w:iCs/>
+          <w:color w:val="555555"/>
+          <w:sz w:val="20"/>
+          <w:szCs w:val="20"/>
+        </w:rPr>
+        <w:tab/>
+      </w:r>
+      <w:r>
+        <w:rPr>
+          <w:i/>
+          <w:iCs/>
+          <w:color w:val="555555"/>
+          <w:sz w:val="20"/>
+          <w:szCs w:val="20"/>
+        </w:rPr>
+        <w:tab/>
       </w:r>
     </w:p>
     <w:sectPr>
@@ -2728,4 +3125,16 @@
     </a:ext>
   </a:extLst>
 </a:theme>
+</file>
+
+<file path=customXml/item1.xml><?xml version="1.0" encoding="utf-8"?>
+<b:Sources xmlns:b="http://schemas.openxmlformats.org/officeDocument/2006/bibliography" xmlns="http://schemas.openxmlformats.org/officeDocument/2006/bibliography" SelectedStyle="\APASixthEditionOfficeOnline.xsl" StyleName="APA" Version="6"/>
+</file>
+
+<file path=customXml/itemProps1.xml><?xml version="1.0" encoding="utf-8"?>
+<ds:datastoreItem xmlns:ds="http://schemas.openxmlformats.org/officeDocument/2006/customXml" ds:itemID="{7AAD701F-AAC9-4B60-B8F6-9FDB7DE20F40}">
+  <ds:schemaRefs>
+    <ds:schemaRef ds:uri="http://schemas.openxmlformats.org/officeDocument/2006/bibliography"/>
+  </ds:schemaRefs>
+</ds:datastoreItem>
 </file>
</xml_diff>